<commit_message>
Fix JMLR formatting: abstract ≤200 words, running title ≤50 chars, official cover letter template, correct AEs from JMLR editorial board
- Abstract: condensed from 334 to 166 words (limit: 200)
- Running title: shortened from 66 to 42 chars (limit: 50)
- Added author name to jmlrheading
- Replaced section* Acknowledgments with acks{} (JMLR template convention)
- Keywords: exactly 5 (was 6)
- Removed duplicate fig:dpi-architecture label
- Cover letter: rewrote using official JmlrOrg/jmlr-coverletter template
- Action Editors: replaced non-AEs with 5 from official JMLR AE list
  (Aragam, Bareinboim, Chiappa, Fukumizu, Kolar)
- Added 5 suggested reviewers (Shimizu, Janzing, Huang, Kocaoglu, Eberhardt)
- Cover letter now includes all required elements:
  disclosure, COI declaration, keywords, reviewers

Co-Authored-By: Tatsuki Onishi <bougtoir@gmail.com>
</commit_message>
<xml_diff>
--- a/spectral-causality-jmlr/cover_letter.docx
+++ b/spectral-causality-jmlr/cover_letter.docx
@@ -4,163 +4,54 @@
   <w:body>
     <w:p>
       <w:pPr>
-        <w:jc w:val="left"/>
+        <w:jc w:val="right"/>
       </w:pPr>
       <w:r>
-        <w:rPr>
-          <w:sz w:val="22"/>
-        </w:rPr>
-        <w:t>Tatsuki Onishi, MD</w:t>
-        <w:br/>
-        <w:t>Department of Anesthesiology</w:t>
-        <w:br/>
-        <w:t>University Hospital, Japan</w:t>
-        <w:br/>
-        <w:t>bougtoir@gmail.com</w:t>
+        <w:t>May 14, 2026</w:t>
       </w:r>
     </w:p>
     <w:p>
       <w:r>
-        <w:t>May 08, 2026</w:t>
-      </w:r>
-    </w:p>
-    <w:p>
-      <w:r>
-        <w:t>Editors</w:t>
-        <w:br/>
         <w:t>Journal of Machine Learning Research</w:t>
       </w:r>
     </w:p>
     <w:p/>
     <w:p>
       <w:r>
-        <w:t>Dear Editors,</w:t>
+        <w:t>Dear Editors:</w:t>
       </w:r>
     </w:p>
     <w:p/>
     <w:p>
       <w:r>
-        <w:t xml:space="preserve">I am writing to submit our manuscript entitled </w:t>
-      </w:r>
-      <w:r>
-        <w:rPr>
-          <w:b/>
-        </w:rPr>
-        <w:t>“Spectral Causality: Causal Direction Estimation via Magnetic Laplacians and Hodge Decomposition”</w:t>
-      </w:r>
-      <w:r>
-        <w:t xml:space="preserve"> for consideration as a regular article in the Journal of Machine Learning Research.</w:t>
+        <w:t>We are writing to submit our manuscript “Spectral Causality: Causal Direction Estimation via Magnetic Laplacians and Hodge Decomposition” to the Journal of Machine Learning Research.</w:t>
       </w:r>
     </w:p>
+    <w:p/>
+    <w:p>
+      <w:r>
+        <w:t>Our manuscript introduces spectral causality, a principled framework that estimates causal directions by exploiting the spectral structure of the magnetic Laplacian. We define a Directional Predictability Index (DPI) that resolves circularity in earlier utility-based formulations, connect the framework to Hodge decomposition to separate DAG-compatible and feedback components of causal flow, and establish scale-invariance and phase-transition results. The approach is validated on synthetic DAGs, the Sachs protein signaling network, and the UCI Heart Disease dataset, with benchmarks against DirectLiNGAM, PC, GES, and NOTEARS.</w:t>
+      </w:r>
+    </w:p>
+    <w:p/>
+    <w:p>
+      <w:r>
+        <w:t>This paper has not been published previously in any journal or conference proceedings. A preprint may be made available on arXiv concurrent with this submission.</w:t>
+      </w:r>
+    </w:p>
+    <w:p/>
+    <w:p>
+      <w:r>
+        <w:t>We suggest the following action editors and referees for our submission.</w:t>
+      </w:r>
+    </w:p>
+    <w:p/>
     <w:p>
       <w:r>
         <w:rPr>
           <w:b/>
         </w:rPr>
-        <w:t xml:space="preserve">Summary. </w:t>
-      </w:r>
-      <w:r>
-        <w:t>This paper introduces spectral causality, a framework that estimates causal directions among observed variables by exploiting the spectral structure of the magnetic Laplacian. Unlike classical Laplacian methods, the magnetic Laplacian’s complex-valued eigenvectors encode edge directionality as phase, enabling causal direction estimation from spectral structure alone. Our principal contributions are:</w:t>
-      </w:r>
-    </w:p>
-    <w:p>
-      <w:pPr>
-        <w:pStyle w:val="ListNumber"/>
-      </w:pPr>
-      <w:r>
-        <w:rPr>
-          <w:b/>
-        </w:rPr>
-        <w:t>Directional Predictability Index (DPI)</w:t>
-      </w:r>
-      <w:r>
-        <w:t xml:space="preserve"> that resolves the circularity in earlier utility-based causal formulations, with partial identifiability guarantees under the additive noise model and explicit convergence rates for each component.</w:t>
-      </w:r>
-    </w:p>
-    <w:p>
-      <w:pPr>
-        <w:pStyle w:val="ListNumber"/>
-      </w:pPr>
-      <w:r>
-        <w:rPr>
-          <w:b/>
-        </w:rPr>
-        <w:t>Hodge-theoretic decomposition</w:t>
-      </w:r>
-      <w:r>
-        <w:t xml:space="preserve"> of causal edge flows into gradient (DAG-compatible), curl (feedback), and harmonic components, yielding a gradient energy ratio r_gradient that serves as a quantitative DAG-adequacy diagnostic—a capability absent from existing causal discovery methods.</w:t>
-      </w:r>
-    </w:p>
-    <w:p>
-      <w:pPr>
-        <w:pStyle w:val="ListNumber"/>
-      </w:pPr>
-      <w:r>
-        <w:rPr>
-          <w:b/>
-        </w:rPr>
-        <w:t>Scale invariance theorem</w:t>
-      </w:r>
-      <w:r>
-        <w:t xml:space="preserve"> establishing that causal structure emergence depends on knowledge quality (sign pattern) rather than quantity (magnitude), together with a phase-transition analysis characterizing a U-shaped knowledge quality curve.</w:t>
-      </w:r>
-    </w:p>
-    <w:p>
-      <w:pPr>
-        <w:pStyle w:val="ListNumber"/>
-      </w:pPr>
-      <w:r>
-        <w:rPr>
-          <w:b/>
-        </w:rPr>
-        <w:t>Comprehensive multi-dataset validation</w:t>
-      </w:r>
-      <w:r>
-        <w:t xml:space="preserve"> on synthetic random DAGs (n=5–20, N=200–1000), the Sachs protein signaling network (n=11, 17 ground-truth edges), and the UCI Heart Disease dataset (n=5, N=297), benchmarked against DirectLiNGAM, the PC algorithm, GES, and NOTEARS.</w:t>
-      </w:r>
-    </w:p>
-    <w:p>
-      <w:r>
-        <w:rPr>
-          <w:b/>
-        </w:rPr>
-        <w:t xml:space="preserve">Relevance to JMLR. </w:t>
-      </w:r>
-      <w:r>
-        <w:t>The manuscript presents a new principled algorithm (spectral causality) grounded in spectral graph theory and Hodge theory, with sound empirical validation on both synthetic and real-world benchmarks. The theoretical analysis (17 theorem-like statements with formal proofs) advances understanding of the relationship between spectral structure and causal ordering. We believe the work is of broad interest to the machine learning community, as causal discovery is a central topic spanning methodology, theory, and applications.</w:t>
-      </w:r>
-    </w:p>
-    <w:p>
-      <w:r>
-        <w:rPr>
-          <w:b/>
-        </w:rPr>
-        <w:t xml:space="preserve">Originality. </w:t>
-      </w:r>
-      <w:r>
-        <w:t>This work has not been published previously in any journal or conference proceedings. A preprint may be made available on arXiv concurrent with this submission.</w:t>
-      </w:r>
-    </w:p>
-    <w:p>
-      <w:r>
-        <w:rPr>
-          <w:b/>
-        </w:rPr>
-        <w:t xml:space="preserve">Disclosure. </w:t>
-      </w:r>
-      <w:r>
-        <w:t>No external funding was received for this work. The author declares no conflicts of interest.</w:t>
-      </w:r>
-    </w:p>
-    <w:p>
-      <w:r>
-        <w:rPr>
-          <w:b/>
-        </w:rPr>
-        <w:t xml:space="preserve">Suggested action editors. </w:t>
-      </w:r>
-      <w:r>
-        <w:t>Based on their expertise in causal discovery and spectral methods, we suggest the following action editors who may be suitable to handle this submission:</w:t>
+        <w:t>Action Editors:</w:t>
       </w:r>
     </w:p>
     <w:p>
@@ -168,13 +59,7 @@
         <w:pStyle w:val="ListBullet"/>
       </w:pPr>
       <w:r>
-        <w:rPr>
-          <w:b/>
-        </w:rPr>
-        <w:t>Bernhard Schölkopf</w:t>
-      </w:r>
-      <w:r>
-        <w:t xml:space="preserve"> — causal inference, kernel methods</w:t>
+        <w:t>Bryon Aragam, University of Chicago — causality, graphical models</w:t>
       </w:r>
     </w:p>
     <w:p>
@@ -182,13 +67,7 @@
         <w:pStyle w:val="ListBullet"/>
       </w:pPr>
       <w:r>
-        <w:rPr>
-          <w:b/>
-        </w:rPr>
-        <w:t>Jonas Peters</w:t>
-      </w:r>
-      <w:r>
-        <w:t xml:space="preserve"> — causal discovery, additive noise models</w:t>
+        <w:t>Elias Bareinboim, Columbia University — causal inference, generalizability</w:t>
       </w:r>
     </w:p>
     <w:p>
@@ -196,13 +75,7 @@
         <w:pStyle w:val="ListBullet"/>
       </w:pPr>
       <w:r>
-        <w:rPr>
-          <w:b/>
-        </w:rPr>
-        <w:t>Peter Spirtes</w:t>
-      </w:r>
-      <w:r>
-        <w:t xml:space="preserve"> — constraint-based causal discovery</w:t>
+        <w:t>Silvia Chiappa, DeepMind — causal inference, variational inference</w:t>
       </w:r>
     </w:p>
     <w:p>
@@ -210,19 +83,82 @@
         <w:pStyle w:val="ListBullet"/>
       </w:pPr>
       <w:r>
-        <w:rPr>
-          <w:b/>
-        </w:rPr>
-        <w:t>Kun Zhang</w:t>
+        <w:t>Kenji Fukumizu, The Institute of Statistical Mathematics, Japan — kernel methods, dimension reduction</w:t>
       </w:r>
+    </w:p>
+    <w:p>
+      <w:pPr>
+        <w:pStyle w:val="ListBullet"/>
+      </w:pPr>
       <w:r>
-        <w:t xml:space="preserve"> — causal discovery methodology</w:t>
+        <w:t>Mladen Kolar, University of Southern California — graphical models, high-dimensional statistics</w:t>
       </w:r>
     </w:p>
     <w:p/>
     <w:p>
       <w:r>
-        <w:t>Thank you for considering this manuscript. I look forward to receiving your editorial decision.</w:t>
+        <w:rPr>
+          <w:b/>
+        </w:rPr>
+        <w:t>Reviewers:</w:t>
+      </w:r>
+    </w:p>
+    <w:p>
+      <w:pPr>
+        <w:pStyle w:val="ListBullet"/>
+      </w:pPr>
+      <w:r>
+        <w:t>Shohei Shimizu, Shiga University, Japan — LiNGAM, causal discovery</w:t>
+      </w:r>
+    </w:p>
+    <w:p>
+      <w:pPr>
+        <w:pStyle w:val="ListBullet"/>
+      </w:pPr>
+      <w:r>
+        <w:t>Dominik Janzing, Amazon Tübingen — causal inference, information-theoretic methods</w:t>
+      </w:r>
+    </w:p>
+    <w:p>
+      <w:pPr>
+        <w:pStyle w:val="ListBullet"/>
+      </w:pPr>
+      <w:r>
+        <w:t>Biwei Huang, UC San Diego — causal discovery, latent variable models</w:t>
+      </w:r>
+    </w:p>
+    <w:p>
+      <w:pPr>
+        <w:pStyle w:val="ListBullet"/>
+      </w:pPr>
+      <w:r>
+        <w:t>Murat Kocaoglu, Purdue University — causal inference, graphical models</w:t>
+      </w:r>
+    </w:p>
+    <w:p>
+      <w:pPr>
+        <w:pStyle w:val="ListBullet"/>
+      </w:pPr>
+      <w:r>
+        <w:t>Frederick Eberhardt, California Institute of Technology — causal inference, Bayesian networks</w:t>
+      </w:r>
+    </w:p>
+    <w:p/>
+    <w:p>
+      <w:r>
+        <w:t>Our submission has the following keywords: causal discovery, magnetic Laplacian, Hodge decomposition, spectral graph theory, directed graphs.</w:t>
+      </w:r>
+    </w:p>
+    <w:p/>
+    <w:p>
+      <w:r>
+        <w:rPr>
+          <w:b/>
+        </w:rPr>
+        <w:t xml:space="preserve">Disclosure of funding and competing interests. </w:t>
+      </w:r>
+      <w:r>
+        <w:t>No external funding was received for this work. The author declares no competing interests. The author has no conflict of interest with any of the suggested action editors or referees listed above.</w:t>
       </w:r>
     </w:p>
     <w:p/>
@@ -234,19 +170,7 @@
     <w:p/>
     <w:p>
       <w:r>
-        <w:rPr>
-          <w:b/>
-        </w:rPr>
-        <w:t>Tatsuki Onishi, MD</w:t>
-      </w:r>
-    </w:p>
-    <w:p>
-      <w:r>
-        <w:t>Department of Anesthesiology</w:t>
-        <w:br/>
-        <w:t>University Hospital, Japan</w:t>
-        <w:br/>
-        <w:t>bougtoir@gmail.com</w:t>
+        <w:t>Tatsuki Onishi (Department of Anesthesiology, University Hospital, Japan)</w:t>
       </w:r>
     </w:p>
     <w:sectPr>

</xml_diff>

<commit_message>
Regenerate all deliverables with latest cover letter and consistency check
Co-Authored-By: Tatsuki Onishi <bougtoir@gmail.com>
</commit_message>
<xml_diff>
--- a/spectral-causality-jmlr/cover_letter.docx
+++ b/spectral-causality-jmlr/cover_letter.docx
@@ -6,6 +6,18 @@
       <w:pPr>
         <w:jc w:val="right"/>
       </w:pPr>
+      <w:r>
+        <w:t>Tatsuki Onishi</w:t>
+        <w:br/>
+      </w:r>
+      <w:r>
+        <w:t>Data Science and AI Innovation Research Promotion Center</w:t>
+        <w:br/>
+        <w:t>Shiga University, Japan</w:t>
+        <w:br/>
+        <w:t>bougtoir@gmail.com</w:t>
+        <w:br/>
+      </w:r>
       <w:r>
         <w:t>May 14, 2026</w:t>
       </w:r>
@@ -24,13 +36,13 @@
     <w:p/>
     <w:p>
       <w:r>
-        <w:t>We are writing to submit our manuscript “Spectral Causality: Causal Direction Estimation via Magnetic Laplacians and Hodge Decomposition” to the Journal of Machine Learning Research.</w:t>
+        <w:t>I am writing to submit my manuscript “Spectral Causality: Causal Direction Estimation via Magnetic Laplacians and Hodge Decomposition” to the Journal of Machine Learning Research.</w:t>
       </w:r>
     </w:p>
     <w:p/>
     <w:p>
       <w:r>
-        <w:t>Our manuscript introduces spectral causality, a principled framework that estimates causal directions by exploiting the spectral structure of the magnetic Laplacian. We define a Directional Predictability Index (DPI) that resolves circularity in earlier utility-based formulations, connect the framework to Hodge decomposition to separate DAG-compatible and feedback components of causal flow, and establish scale-invariance and phase-transition results. The approach is validated on synthetic DAGs, the Sachs protein signaling network, and the UCI Heart Disease dataset, with benchmarks against DirectLiNGAM, PC, GES, and NOTEARS.</w:t>
+        <w:t>The manuscript introduces spectral causality, a principled framework that estimates causal directions by exploiting the spectral structure of the magnetic Laplacian. I define a Directional Predictability Index (DPI) that resolves circularity in earlier utility-based formulations, connect the framework to Hodge decomposition to separate DAG-compatible and feedback components of causal flow, and establish scale-invariance and phase-transition results. The approach is validated on synthetic DAGs, the Sachs protein signaling network, and the UCI Heart Disease dataset, with benchmarks against DirectLiNGAM, PC, GES, and NOTEARS.</w:t>
       </w:r>
     </w:p>
     <w:p/>
@@ -42,7 +54,7 @@
     <w:p/>
     <w:p>
       <w:r>
-        <w:t>We suggest the following action editors and referees for our submission.</w:t>
+        <w:t>I suggest the following action editors and referees for this submission.</w:t>
       </w:r>
     </w:p>
     <w:p/>
@@ -146,7 +158,13 @@
     <w:p/>
     <w:p>
       <w:r>
-        <w:t>Our submission has the following keywords: causal discovery, magnetic Laplacian, Hodge decomposition, spectral graph theory, directed graphs.</w:t>
+        <w:t>This submission has the following keywords: causal discovery, magnetic Laplacian, Hodge decomposition, spectral graph theory, directed graphs.</w:t>
+      </w:r>
+    </w:p>
+    <w:p/>
+    <w:p>
+      <w:r>
+        <w:t>As the corresponding (and sole) author, I confirm that I have no conflict of interest with the action editors and referees suggested above.</w:t>
       </w:r>
     </w:p>
     <w:p/>
@@ -158,7 +176,7 @@
         <w:t xml:space="preserve">Disclosure of funding and competing interests. </w:t>
       </w:r>
       <w:r>
-        <w:t>No external funding was received for this work. The author declares no competing interests. The author has no conflict of interest with any of the suggested action editors or referees listed above.</w:t>
+        <w:t>No external funding was received for this work. The author declares no competing interests.</w:t>
       </w:r>
     </w:p>
     <w:p/>
@@ -170,7 +188,11 @@
     <w:p/>
     <w:p>
       <w:r>
-        <w:t>Tatsuki Onishi (Department of Anesthesiology, University Hospital, Japan)</w:t>
+        <w:t>Tatsuki Onishi</w:t>
+        <w:br/>
+        <w:t>Data Science and AI Innovation Research Promotion Center</w:t>
+        <w:br/>
+        <w:t>Shiga University, Japan</w:t>
       </w:r>
     </w:p>
     <w:sectPr>

</xml_diff>